<commit_message>
Add four more paper names to the paper names table
Co-Authored-By: Claude Opus 5.5 <noreply@anthropic.com>
Claude-Session: https://claude.ai/code/session_01AaY8xvSMqTejETtiYRQULd
</commit_message>
<xml_diff>
--- a/out/Paper_Names.docx
+++ b/out/Paper_Names.docx
@@ -154,6 +154,94 @@
           <w:p>
             <w:r>
               <w:t>The Jurisdictional Collision in Cox’s Bazar: Conceptualizing "Digital Refoulement" as a Breach of Jus Cogens Norms and as an Abuse of Sovereignty in International Law</w:t>
+            </w:r>
+          </w:p>
+        </w:tc>
+      </w:tr>
+      <w:tr>
+        <w:tc>
+          <w:tcPr>
+            <w:tcW w:type="dxa" w:w="4320"/>
+          </w:tcPr>
+          <w:p>
+            <w:r>
+              <w:t>6</w:t>
+            </w:r>
+          </w:p>
+        </w:tc>
+        <w:tc>
+          <w:tcPr>
+            <w:tcW w:type="dxa" w:w="4320"/>
+          </w:tcPr>
+          <w:p>
+            <w:r>
+              <w:t>Economic Transition, Migration and Refugee Law: Global, Regional and Domestic Challenges for Bangladesh</w:t>
+            </w:r>
+          </w:p>
+        </w:tc>
+      </w:tr>
+      <w:tr>
+        <w:tc>
+          <w:tcPr>
+            <w:tcW w:type="dxa" w:w="4320"/>
+          </w:tcPr>
+          <w:p>
+            <w:r>
+              <w:t>7</w:t>
+            </w:r>
+          </w:p>
+        </w:tc>
+        <w:tc>
+          <w:tcPr>
+            <w:tcW w:type="dxa" w:w="4320"/>
+          </w:tcPr>
+          <w:p>
+            <w:r>
+              <w:t>Examining the Case for Recognising Environmental Destruction as an International Crime</w:t>
+            </w:r>
+          </w:p>
+        </w:tc>
+      </w:tr>
+      <w:tr>
+        <w:tc>
+          <w:tcPr>
+            <w:tcW w:type="dxa" w:w="4320"/>
+          </w:tcPr>
+          <w:p>
+            <w:r>
+              <w:t>8</w:t>
+            </w:r>
+          </w:p>
+        </w:tc>
+        <w:tc>
+          <w:tcPr>
+            <w:tcW w:type="dxa" w:w="4320"/>
+          </w:tcPr>
+          <w:p>
+            <w:r>
+              <w:t>Necessity to Controversy: A Critical Appraisal of the Special Powers Act, 1974</w:t>
+            </w:r>
+          </w:p>
+        </w:tc>
+      </w:tr>
+      <w:tr>
+        <w:tc>
+          <w:tcPr>
+            <w:tcW w:type="dxa" w:w="4320"/>
+          </w:tcPr>
+          <w:p>
+            <w:r>
+              <w:t>9</w:t>
+            </w:r>
+          </w:p>
+        </w:tc>
+        <w:tc>
+          <w:tcPr>
+            <w:tcW w:type="dxa" w:w="4320"/>
+          </w:tcPr>
+          <w:p>
+            <w:r>
+              <w:t>Political Detention by Design: Analyzing the Special Powers Act, 1974 as an Instrument of Political Power Across Party Regimes</w:t>
             </w:r>
           </w:p>
         </w:tc>

</xml_diff>

<commit_message>
Add three more paper names to the paper names table
Co-Authored-By: Claude Opus 5.5 <noreply@anthropic.com>
Claude-Session: https://claude.ai/code/session_01AaY8xvSMqTejETtiYRQULd
</commit_message>
<xml_diff>
--- a/out/Paper_Names.docx
+++ b/out/Paper_Names.docx
@@ -242,6 +242,72 @@
           <w:p>
             <w:r>
               <w:t>Political Detention by Design: Analyzing the Special Powers Act, 1974 as an Instrument of Political Power Across Party Regimes</w:t>
+            </w:r>
+          </w:p>
+        </w:tc>
+      </w:tr>
+      <w:tr>
+        <w:tc>
+          <w:tcPr>
+            <w:tcW w:type="dxa" w:w="4320"/>
+          </w:tcPr>
+          <w:p>
+            <w:r>
+              <w:t>10</w:t>
+            </w:r>
+          </w:p>
+        </w:tc>
+        <w:tc>
+          <w:tcPr>
+            <w:tcW w:type="dxa" w:w="4320"/>
+          </w:tcPr>
+          <w:p>
+            <w:r>
+              <w:t>Refugees Are Often Faced Challenges: Differences Between Theory and Practice for Refugee Rights Protection in South Asian Subcontinent</w:t>
+            </w:r>
+          </w:p>
+        </w:tc>
+      </w:tr>
+      <w:tr>
+        <w:tc>
+          <w:tcPr>
+            <w:tcW w:type="dxa" w:w="4320"/>
+          </w:tcPr>
+          <w:p>
+            <w:r>
+              <w:t>11</w:t>
+            </w:r>
+          </w:p>
+        </w:tc>
+        <w:tc>
+          <w:tcPr>
+            <w:tcW w:type="dxa" w:w="4320"/>
+          </w:tcPr>
+          <w:p>
+            <w:r>
+              <w:t>The Death Penalty in the Modern World</w:t>
+            </w:r>
+          </w:p>
+        </w:tc>
+      </w:tr>
+      <w:tr>
+        <w:tc>
+          <w:tcPr>
+            <w:tcW w:type="dxa" w:w="4320"/>
+          </w:tcPr>
+          <w:p>
+            <w:r>
+              <w:t>12</w:t>
+            </w:r>
+          </w:p>
+        </w:tc>
+        <w:tc>
+          <w:tcPr>
+            <w:tcW w:type="dxa" w:w="4320"/>
+          </w:tcPr>
+          <w:p>
+            <w:r>
+              <w:t>Transboundary Environmental Pollution in Bangladesh: Risks, Hurdles and Possibilities Under the International Framework</w:t>
             </w:r>
           </w:p>
         </w:tc>

</xml_diff>

<commit_message>
Add plagiarism and AI score columns to the paper names table
Co-Authored-By: Claude Opus 5.5 <noreply@anthropic.com>
Claude-Session: https://claude.ai/code/session_01AaY8xvSMqTejETtiYRQULd
</commit_message>
<xml_diff>
--- a/out/Paper_Names.docx
+++ b/out/Paper_Names.docx
@@ -14,16 +14,19 @@
       <w:tblPr>
         <w:tblStyle w:val="TableGrid"/>
         <w:tblW w:type="auto" w:w="0"/>
+        <w:tblLayout w:type="fixed"/>
         <w:tblLook w:firstColumn="1" w:firstRow="1" w:lastColumn="0" w:lastRow="0" w:noHBand="0" w:noVBand="1" w:val="04A0"/>
       </w:tblPr>
       <w:tblGrid>
+        <w:gridCol w:w="4320"/>
+        <w:gridCol w:w="4320"/>
         <w:gridCol w:w="4320"/>
         <w:gridCol w:w="4320"/>
       </w:tblGrid>
       <w:tr>
         <w:tc>
           <w:tcPr>
-            <w:tcW w:type="dxa" w:w="4320"/>
+            <w:tcW w:type="dxa" w:w="720"/>
           </w:tcPr>
           <w:p>
             <w:r>
@@ -36,7 +39,7 @@
         </w:tc>
         <w:tc>
           <w:tcPr>
-            <w:tcW w:type="dxa" w:w="4320"/>
+            <w:tcW w:type="dxa" w:w="5760"/>
           </w:tcPr>
           <w:p>
             <w:r>
@@ -47,11 +50,37 @@
             </w:r>
           </w:p>
         </w:tc>
+        <w:tc>
+          <w:tcPr>
+            <w:tcW w:type="dxa" w:w="1440"/>
+          </w:tcPr>
+          <w:p>
+            <w:r>
+              <w:rPr>
+                <w:b/>
+              </w:rPr>
+              <w:t>Plagiarism %</w:t>
+            </w:r>
+          </w:p>
+        </w:tc>
+        <w:tc>
+          <w:tcPr>
+            <w:tcW w:type="dxa" w:w="1440"/>
+          </w:tcPr>
+          <w:p>
+            <w:r>
+              <w:rPr>
+                <w:b/>
+              </w:rPr>
+              <w:t>AI %</w:t>
+            </w:r>
+          </w:p>
+        </w:tc>
       </w:tr>
       <w:tr>
         <w:tc>
           <w:tcPr>
-            <w:tcW w:type="dxa" w:w="4320"/>
+            <w:tcW w:type="dxa" w:w="720"/>
           </w:tcPr>
           <w:p>
             <w:r>
@@ -61,7 +90,7 @@
         </w:tc>
         <w:tc>
           <w:tcPr>
-            <w:tcW w:type="dxa" w:w="4320"/>
+            <w:tcW w:type="dxa" w:w="5760"/>
           </w:tcPr>
           <w:p>
             <w:r>
@@ -69,11 +98,23 @@
             </w:r>
           </w:p>
         </w:tc>
+        <w:tc>
+          <w:tcPr>
+            <w:tcW w:type="dxa" w:w="1440"/>
+          </w:tcPr>
+          <w:p/>
+        </w:tc>
+        <w:tc>
+          <w:tcPr>
+            <w:tcW w:type="dxa" w:w="1440"/>
+          </w:tcPr>
+          <w:p/>
+        </w:tc>
       </w:tr>
       <w:tr>
         <w:tc>
           <w:tcPr>
-            <w:tcW w:type="dxa" w:w="4320"/>
+            <w:tcW w:type="dxa" w:w="720"/>
           </w:tcPr>
           <w:p>
             <w:r>
@@ -83,7 +124,7 @@
         </w:tc>
         <w:tc>
           <w:tcPr>
-            <w:tcW w:type="dxa" w:w="4320"/>
+            <w:tcW w:type="dxa" w:w="5760"/>
           </w:tcPr>
           <w:p>
             <w:r>
@@ -91,11 +132,31 @@
             </w:r>
           </w:p>
         </w:tc>
+        <w:tc>
+          <w:tcPr>
+            <w:tcW w:type="dxa" w:w="1440"/>
+          </w:tcPr>
+          <w:p>
+            <w:r>
+              <w:t>11%</w:t>
+            </w:r>
+          </w:p>
+        </w:tc>
+        <w:tc>
+          <w:tcPr>
+            <w:tcW w:type="dxa" w:w="1440"/>
+          </w:tcPr>
+          <w:p>
+            <w:r>
+              <w:t>Not in report</w:t>
+            </w:r>
+          </w:p>
+        </w:tc>
       </w:tr>
       <w:tr>
         <w:tc>
           <w:tcPr>
-            <w:tcW w:type="dxa" w:w="4320"/>
+            <w:tcW w:type="dxa" w:w="720"/>
           </w:tcPr>
           <w:p>
             <w:r>
@@ -105,7 +166,7 @@
         </w:tc>
         <w:tc>
           <w:tcPr>
-            <w:tcW w:type="dxa" w:w="4320"/>
+            <w:tcW w:type="dxa" w:w="5760"/>
           </w:tcPr>
           <w:p>
             <w:r>
@@ -113,11 +174,31 @@
             </w:r>
           </w:p>
         </w:tc>
+        <w:tc>
+          <w:tcPr>
+            <w:tcW w:type="dxa" w:w="1440"/>
+          </w:tcPr>
+          <w:p>
+            <w:r>
+              <w:t>2%</w:t>
+            </w:r>
+          </w:p>
+        </w:tc>
+        <w:tc>
+          <w:tcPr>
+            <w:tcW w:type="dxa" w:w="1440"/>
+          </w:tcPr>
+          <w:p>
+            <w:r>
+              <w:t>Not in report</w:t>
+            </w:r>
+          </w:p>
+        </w:tc>
       </w:tr>
       <w:tr>
         <w:tc>
           <w:tcPr>
-            <w:tcW w:type="dxa" w:w="4320"/>
+            <w:tcW w:type="dxa" w:w="720"/>
           </w:tcPr>
           <w:p>
             <w:r>
@@ -127,7 +208,7 @@
         </w:tc>
         <w:tc>
           <w:tcPr>
-            <w:tcW w:type="dxa" w:w="4320"/>
+            <w:tcW w:type="dxa" w:w="5760"/>
           </w:tcPr>
           <w:p>
             <w:r>
@@ -135,11 +216,23 @@
             </w:r>
           </w:p>
         </w:tc>
+        <w:tc>
+          <w:tcPr>
+            <w:tcW w:type="dxa" w:w="1440"/>
+          </w:tcPr>
+          <w:p/>
+        </w:tc>
+        <w:tc>
+          <w:tcPr>
+            <w:tcW w:type="dxa" w:w="1440"/>
+          </w:tcPr>
+          <w:p/>
+        </w:tc>
       </w:tr>
       <w:tr>
         <w:tc>
           <w:tcPr>
-            <w:tcW w:type="dxa" w:w="4320"/>
+            <w:tcW w:type="dxa" w:w="720"/>
           </w:tcPr>
           <w:p>
             <w:r>
@@ -149,7 +242,7 @@
         </w:tc>
         <w:tc>
           <w:tcPr>
-            <w:tcW w:type="dxa" w:w="4320"/>
+            <w:tcW w:type="dxa" w:w="5760"/>
           </w:tcPr>
           <w:p>
             <w:r>
@@ -157,11 +250,31 @@
             </w:r>
           </w:p>
         </w:tc>
+        <w:tc>
+          <w:tcPr>
+            <w:tcW w:type="dxa" w:w="1440"/>
+          </w:tcPr>
+          <w:p>
+            <w:r>
+              <w:t>9%</w:t>
+            </w:r>
+          </w:p>
+        </w:tc>
+        <w:tc>
+          <w:tcPr>
+            <w:tcW w:type="dxa" w:w="1440"/>
+          </w:tcPr>
+          <w:p>
+            <w:r>
+              <w:t>Not in report</w:t>
+            </w:r>
+          </w:p>
+        </w:tc>
       </w:tr>
       <w:tr>
         <w:tc>
           <w:tcPr>
-            <w:tcW w:type="dxa" w:w="4320"/>
+            <w:tcW w:type="dxa" w:w="720"/>
           </w:tcPr>
           <w:p>
             <w:r>
@@ -171,7 +284,7 @@
         </w:tc>
         <w:tc>
           <w:tcPr>
-            <w:tcW w:type="dxa" w:w="4320"/>
+            <w:tcW w:type="dxa" w:w="5760"/>
           </w:tcPr>
           <w:p>
             <w:r>
@@ -179,11 +292,23 @@
             </w:r>
           </w:p>
         </w:tc>
+        <w:tc>
+          <w:tcPr>
+            <w:tcW w:type="dxa" w:w="1440"/>
+          </w:tcPr>
+          <w:p/>
+        </w:tc>
+        <w:tc>
+          <w:tcPr>
+            <w:tcW w:type="dxa" w:w="1440"/>
+          </w:tcPr>
+          <w:p/>
+        </w:tc>
       </w:tr>
       <w:tr>
         <w:tc>
           <w:tcPr>
-            <w:tcW w:type="dxa" w:w="4320"/>
+            <w:tcW w:type="dxa" w:w="720"/>
           </w:tcPr>
           <w:p>
             <w:r>
@@ -193,7 +318,7 @@
         </w:tc>
         <w:tc>
           <w:tcPr>
-            <w:tcW w:type="dxa" w:w="4320"/>
+            <w:tcW w:type="dxa" w:w="5760"/>
           </w:tcPr>
           <w:p>
             <w:r>
@@ -201,11 +326,23 @@
             </w:r>
           </w:p>
         </w:tc>
+        <w:tc>
+          <w:tcPr>
+            <w:tcW w:type="dxa" w:w="1440"/>
+          </w:tcPr>
+          <w:p/>
+        </w:tc>
+        <w:tc>
+          <w:tcPr>
+            <w:tcW w:type="dxa" w:w="1440"/>
+          </w:tcPr>
+          <w:p/>
+        </w:tc>
       </w:tr>
       <w:tr>
         <w:tc>
           <w:tcPr>
-            <w:tcW w:type="dxa" w:w="4320"/>
+            <w:tcW w:type="dxa" w:w="720"/>
           </w:tcPr>
           <w:p>
             <w:r>
@@ -215,7 +352,7 @@
         </w:tc>
         <w:tc>
           <w:tcPr>
-            <w:tcW w:type="dxa" w:w="4320"/>
+            <w:tcW w:type="dxa" w:w="5760"/>
           </w:tcPr>
           <w:p>
             <w:r>
@@ -223,11 +360,23 @@
             </w:r>
           </w:p>
         </w:tc>
+        <w:tc>
+          <w:tcPr>
+            <w:tcW w:type="dxa" w:w="1440"/>
+          </w:tcPr>
+          <w:p/>
+        </w:tc>
+        <w:tc>
+          <w:tcPr>
+            <w:tcW w:type="dxa" w:w="1440"/>
+          </w:tcPr>
+          <w:p/>
+        </w:tc>
       </w:tr>
       <w:tr>
         <w:tc>
           <w:tcPr>
-            <w:tcW w:type="dxa" w:w="4320"/>
+            <w:tcW w:type="dxa" w:w="720"/>
           </w:tcPr>
           <w:p>
             <w:r>
@@ -237,7 +386,7 @@
         </w:tc>
         <w:tc>
           <w:tcPr>
-            <w:tcW w:type="dxa" w:w="4320"/>
+            <w:tcW w:type="dxa" w:w="5760"/>
           </w:tcPr>
           <w:p>
             <w:r>
@@ -245,11 +394,23 @@
             </w:r>
           </w:p>
         </w:tc>
+        <w:tc>
+          <w:tcPr>
+            <w:tcW w:type="dxa" w:w="1440"/>
+          </w:tcPr>
+          <w:p/>
+        </w:tc>
+        <w:tc>
+          <w:tcPr>
+            <w:tcW w:type="dxa" w:w="1440"/>
+          </w:tcPr>
+          <w:p/>
+        </w:tc>
       </w:tr>
       <w:tr>
         <w:tc>
           <w:tcPr>
-            <w:tcW w:type="dxa" w:w="4320"/>
+            <w:tcW w:type="dxa" w:w="720"/>
           </w:tcPr>
           <w:p>
             <w:r>
@@ -259,7 +420,7 @@
         </w:tc>
         <w:tc>
           <w:tcPr>
-            <w:tcW w:type="dxa" w:w="4320"/>
+            <w:tcW w:type="dxa" w:w="5760"/>
           </w:tcPr>
           <w:p>
             <w:r>
@@ -267,11 +428,23 @@
             </w:r>
           </w:p>
         </w:tc>
+        <w:tc>
+          <w:tcPr>
+            <w:tcW w:type="dxa" w:w="1440"/>
+          </w:tcPr>
+          <w:p/>
+        </w:tc>
+        <w:tc>
+          <w:tcPr>
+            <w:tcW w:type="dxa" w:w="1440"/>
+          </w:tcPr>
+          <w:p/>
+        </w:tc>
       </w:tr>
       <w:tr>
         <w:tc>
           <w:tcPr>
-            <w:tcW w:type="dxa" w:w="4320"/>
+            <w:tcW w:type="dxa" w:w="720"/>
           </w:tcPr>
           <w:p>
             <w:r>
@@ -281,7 +454,7 @@
         </w:tc>
         <w:tc>
           <w:tcPr>
-            <w:tcW w:type="dxa" w:w="4320"/>
+            <w:tcW w:type="dxa" w:w="5760"/>
           </w:tcPr>
           <w:p>
             <w:r>
@@ -289,11 +462,31 @@
             </w:r>
           </w:p>
         </w:tc>
+        <w:tc>
+          <w:tcPr>
+            <w:tcW w:type="dxa" w:w="1440"/>
+          </w:tcPr>
+          <w:p>
+            <w:r>
+              <w:t>2%</w:t>
+            </w:r>
+          </w:p>
+        </w:tc>
+        <w:tc>
+          <w:tcPr>
+            <w:tcW w:type="dxa" w:w="1440"/>
+          </w:tcPr>
+          <w:p>
+            <w:r>
+              <w:t>Not in report</w:t>
+            </w:r>
+          </w:p>
+        </w:tc>
       </w:tr>
       <w:tr>
         <w:tc>
           <w:tcPr>
-            <w:tcW w:type="dxa" w:w="4320"/>
+            <w:tcW w:type="dxa" w:w="720"/>
           </w:tcPr>
           <w:p>
             <w:r>
@@ -303,13 +496,25 @@
         </w:tc>
         <w:tc>
           <w:tcPr>
-            <w:tcW w:type="dxa" w:w="4320"/>
+            <w:tcW w:type="dxa" w:w="5760"/>
           </w:tcPr>
           <w:p>
             <w:r>
               <w:t>Transboundary Environmental Pollution in Bangladesh: Risks, Hurdles and Possibilities Under the International Framework</w:t>
             </w:r>
           </w:p>
+        </w:tc>
+        <w:tc>
+          <w:tcPr>
+            <w:tcW w:type="dxa" w:w="1440"/>
+          </w:tcPr>
+          <w:p/>
+        </w:tc>
+        <w:tc>
+          <w:tcPr>
+            <w:tcW w:type="dxa" w:w="1440"/>
+          </w:tcPr>
+          <w:p/>
         </w:tc>
       </w:tr>
     </w:tbl>

</xml_diff>

<commit_message>
Add plagiarism scores for five more papers
Co-Authored-By: Claude Opus 5.5 <noreply@anthropic.com>
Claude-Session: https://claude.ai/code/session_01AaY8xvSMqTejETtiYRQULd
</commit_message>
<xml_diff>
--- a/out/Paper_Names.docx
+++ b/out/Paper_Names.docx
@@ -296,13 +296,21 @@
           <w:tcPr>
             <w:tcW w:type="dxa" w:w="1440"/>
           </w:tcPr>
-          <w:p/>
+          <w:p>
+            <w:r>
+              <w:t>10%</w:t>
+            </w:r>
+          </w:p>
         </w:tc>
         <w:tc>
           <w:tcPr>
             <w:tcW w:type="dxa" w:w="1440"/>
           </w:tcPr>
-          <w:p/>
+          <w:p>
+            <w:r>
+              <w:t>Not in report</w:t>
+            </w:r>
+          </w:p>
         </w:tc>
       </w:tr>
       <w:tr>
@@ -330,13 +338,21 @@
           <w:tcPr>
             <w:tcW w:type="dxa" w:w="1440"/>
           </w:tcPr>
-          <w:p/>
+          <w:p>
+            <w:r>
+              <w:t>16%</w:t>
+            </w:r>
+          </w:p>
         </w:tc>
         <w:tc>
           <w:tcPr>
             <w:tcW w:type="dxa" w:w="1440"/>
           </w:tcPr>
-          <w:p/>
+          <w:p>
+            <w:r>
+              <w:t>Not in report</w:t>
+            </w:r>
+          </w:p>
         </w:tc>
       </w:tr>
       <w:tr>
@@ -398,13 +414,21 @@
           <w:tcPr>
             <w:tcW w:type="dxa" w:w="1440"/>
           </w:tcPr>
-          <w:p/>
+          <w:p>
+            <w:r>
+              <w:t>4%</w:t>
+            </w:r>
+          </w:p>
         </w:tc>
         <w:tc>
           <w:tcPr>
             <w:tcW w:type="dxa" w:w="1440"/>
           </w:tcPr>
-          <w:p/>
+          <w:p>
+            <w:r>
+              <w:t>Not in report</w:t>
+            </w:r>
+          </w:p>
         </w:tc>
       </w:tr>
       <w:tr>
@@ -432,13 +456,21 @@
           <w:tcPr>
             <w:tcW w:type="dxa" w:w="1440"/>
           </w:tcPr>
-          <w:p/>
+          <w:p>
+            <w:r>
+              <w:t>13%</w:t>
+            </w:r>
+          </w:p>
         </w:tc>
         <w:tc>
           <w:tcPr>
             <w:tcW w:type="dxa" w:w="1440"/>
           </w:tcPr>
-          <w:p/>
+          <w:p>
+            <w:r>
+              <w:t>Not in report</w:t>
+            </w:r>
+          </w:p>
         </w:tc>
       </w:tr>
       <w:tr>
@@ -508,13 +540,21 @@
           <w:tcPr>
             <w:tcW w:type="dxa" w:w="1440"/>
           </w:tcPr>
-          <w:p/>
+          <w:p>
+            <w:r>
+              <w:t>25%</w:t>
+            </w:r>
+          </w:p>
         </w:tc>
         <w:tc>
           <w:tcPr>
             <w:tcW w:type="dxa" w:w="1440"/>
           </w:tcPr>
-          <w:p/>
+          <w:p>
+            <w:r>
+              <w:t>Not in report</w:t>
+            </w:r>
+          </w:p>
         </w:tc>
       </w:tr>
     </w:tbl>

</xml_diff>

<commit_message>
Add plagiarism scores for the remaining papers
Co-Authored-By: Claude Opus 5.5 <noreply@anthropic.com>
Claude-Session: https://claude.ai/code/session_01AaY8xvSMqTejETtiYRQULd
</commit_message>
<xml_diff>
--- a/out/Paper_Names.docx
+++ b/out/Paper_Names.docx
@@ -102,13 +102,21 @@
           <w:tcPr>
             <w:tcW w:type="dxa" w:w="1440"/>
           </w:tcPr>
-          <w:p/>
+          <w:p>
+            <w:r>
+              <w:t>8%</w:t>
+            </w:r>
+          </w:p>
         </w:tc>
         <w:tc>
           <w:tcPr>
             <w:tcW w:type="dxa" w:w="1440"/>
           </w:tcPr>
-          <w:p/>
+          <w:p>
+            <w:r>
+              <w:t>Not in report</w:t>
+            </w:r>
+          </w:p>
         </w:tc>
       </w:tr>
       <w:tr>
@@ -220,13 +228,21 @@
           <w:tcPr>
             <w:tcW w:type="dxa" w:w="1440"/>
           </w:tcPr>
-          <w:p/>
+          <w:p>
+            <w:r>
+              <w:t>8%</w:t>
+            </w:r>
+          </w:p>
         </w:tc>
         <w:tc>
           <w:tcPr>
             <w:tcW w:type="dxa" w:w="1440"/>
           </w:tcPr>
-          <w:p/>
+          <w:p>
+            <w:r>
+              <w:t>Not in report</w:t>
+            </w:r>
+          </w:p>
         </w:tc>
       </w:tr>
       <w:tr>
@@ -298,7 +314,7 @@
           </w:tcPr>
           <w:p>
             <w:r>
-              <w:t>10%</w:t>
+              <w:t>16%</w:t>
             </w:r>
           </w:p>
         </w:tc>
@@ -380,13 +396,21 @@
           <w:tcPr>
             <w:tcW w:type="dxa" w:w="1440"/>
           </w:tcPr>
-          <w:p/>
+          <w:p>
+            <w:r>
+              <w:t>19%</w:t>
+            </w:r>
+          </w:p>
         </w:tc>
         <w:tc>
           <w:tcPr>
             <w:tcW w:type="dxa" w:w="1440"/>
           </w:tcPr>
-          <w:p/>
+          <w:p>
+            <w:r>
+              <w:t>Not in report</w:t>
+            </w:r>
+          </w:p>
         </w:tc>
       </w:tr>
       <w:tr>

</xml_diff>